<commit_message>
Improve UAT docs: checkboxes on features only, cleaner labels, and modern report appendix
</commit_message>
<xml_diff>
--- a/docs/اختبار-الأدوار-والصلاحيات.docx
+++ b/docs/اختبار-الأدوار-والصلاحيات.docx
@@ -2,33 +2,111 @@
 <file path=word/document.xml><?xml version="1.0" encoding="utf-8"?>
 <w:document xmlns:wpc="http://schemas.microsoft.com/office/word/2010/wordprocessingCanvas" xmlns:mo="http://schemas.microsoft.com/office/mac/office/2008/main" xmlns:mc="http://schemas.openxmlformats.org/markup-compatibility/2006" xmlns:mv="urn:schemas-microsoft-com:mac:vml" xmlns:o="urn:schemas-microsoft-com:office:office" xmlns:r="http://schemas.openxmlformats.org/officeDocument/2006/relationships" xmlns:m="http://schemas.openxmlformats.org/officeDocument/2006/math" xmlns:v="urn:schemas-microsoft-com:vml" xmlns:wp14="http://schemas.microsoft.com/office/word/2010/wordprocessingDrawing" xmlns:wp="http://schemas.openxmlformats.org/drawingml/2006/wordprocessingDrawing" xmlns:w10="urn:schemas-microsoft-com:office:word" xmlns:w="http://schemas.openxmlformats.org/wordprocessingml/2006/main" xmlns:w14="http://schemas.microsoft.com/office/word/2010/wordml" xmlns:wpg="http://schemas.microsoft.com/office/word/2010/wordprocessingGroup" xmlns:wpi="http://schemas.microsoft.com/office/word/2010/wordprocessingInk" xmlns:wne="http://schemas.microsoft.com/office/word/2006/wordml" xmlns:wps="http://schemas.microsoft.com/office/word/2010/wordprocessingShape" mc:Ignorable="w14 wp14">
   <w:body>
+    <w:tbl>
+      <w:tblPr>
+        <w:tblStyle w:val="TableGrid"/>
+        <w:tblW w:type="auto" w:w="0"/>
+        <w:tblLook w:firstColumn="1" w:firstRow="1" w:lastColumn="0" w:lastRow="0" w:noHBand="0" w:noVBand="1" w:val="04A0"/>
+      </w:tblPr>
+      <w:tblGrid>
+        <w:gridCol w:w="9638"/>
+      </w:tblGrid>
+      <w:tr>
+        <w:tc>
+          <w:tcPr>
+            <w:tcW w:type="dxa" w:w="9638"/>
+            <w:shd w:fill="EDE9FF"/>
+          </w:tcPr>
+          <w:p>
+            <w:pPr>
+              <w:jc w:val="center"/>
+              <w:bidi/>
+            </w:pPr>
+            <w:r>
+              <w:rPr>
+                <w:b/>
+                <w:color w:val="5B2EFF"/>
+                <w:sz w:val="56"/>
+              </w:rPr>
+              <w:t>دليل اختبار الأدوار والصلاحيات</w:t>
+            </w:r>
+          </w:p>
+        </w:tc>
+      </w:tr>
+      <w:tr>
+        <w:tc>
+          <w:tcPr>
+            <w:tcW w:type="dxa" w:w="9638"/>
+            <w:shd w:fill="EDE9FF"/>
+          </w:tcPr>
+          <w:p>
+            <w:pPr>
+              <w:jc w:val="center"/>
+              <w:bidi/>
+            </w:pPr>
+            <w:r>
+              <w:rPr>
+                <w:b/>
+                <w:color w:val="7C5CFF"/>
+                <w:sz w:val="32"/>
+              </w:rPr>
+              <w:t>نظام مرحّاب</w:t>
+            </w:r>
+          </w:p>
+        </w:tc>
+      </w:tr>
+      <w:tr>
+        <w:tc>
+          <w:tcPr>
+            <w:tcW w:type="dxa" w:w="9638"/>
+            <w:shd w:fill="EDE9FF"/>
+          </w:tcPr>
+          <w:p>
+            <w:pPr>
+              <w:jc w:val="center"/>
+              <w:bidi/>
+            </w:pPr>
+            <w:r>
+              <w:rPr>
+                <w:b w:val="0"/>
+                <w:color w:val="333355"/>
+                <w:sz w:val="26"/>
+              </w:rPr>
+              <w:t>تاريخ الإصدار: 02-07-2026</w:t>
+            </w:r>
+          </w:p>
+        </w:tc>
+      </w:tr>
+      <w:tr>
+        <w:tc>
+          <w:tcPr>
+            <w:tcW w:type="dxa" w:w="9638"/>
+            <w:shd w:fill="EDE9FF"/>
+          </w:tcPr>
+          <w:p>
+            <w:pPr>
+              <w:jc w:val="center"/>
+              <w:bidi/>
+            </w:pPr>
+            <w:r>
+              <w:rPr>
+                <w:b w:val="0"/>
+                <w:color w:val="555577"/>
+                <w:sz w:val="26"/>
+              </w:rPr>
+              <w:t>اختبار قبول المستخدم — UAT</w:t>
+            </w:r>
+          </w:p>
+        </w:tc>
+      </w:tr>
+    </w:tbl>
+    <w:p/>
     <w:p>
       <w:pPr>
-        <w:pStyle w:val="Title"/>
-        <w:jc w:val="center"/>
         <w:bidi/>
       </w:pPr>
       <w:r>
-        <w:t>دليل اختبار الأدوار والصلاحيات</w:t>
-      </w:r>
-    </w:p>
-    <w:p>
-      <w:pPr>
-        <w:jc w:val="center"/>
-        <w:bidi/>
-      </w:pPr>
-      <w:r>
-        <w:t>نظام مرحّاب — UAT</w:t>
-      </w:r>
-    </w:p>
-    <w:p>
-      <w:r>
-        <w:t>تاريخ الإصدار: 2026-07-02</w:t>
-      </w:r>
-    </w:p>
-    <w:p>
-      <w:r>
-        <w:t>طريقة الاستخدام: نفّذ كل صف في الجدول وضع علامة ✓ في عمود «تم» عند النجاح.</w:t>
+        <w:t>طريقة الاستخدام: نفّذ كل صف في الجدول وضع علامة ✓ في عمود المربعات عند النجاح (المربعات قصاد الميزات فقط — وليس قصاد العناوين).</w:t>
       </w:r>
     </w:p>
     <w:p>
@@ -101,9 +179,7 @@
             <w:r>
               <w:rPr>
                 <w:b/>
-                <w:sz w:val="34"/>
               </w:rPr>
-              <w:t>☐</w:t>
             </w:r>
           </w:p>
         </w:tc>
@@ -119,6 +195,7 @@
             <w:r>
               <w:rPr>
                 <w:b/>
+                <w:sz w:val="20"/>
               </w:rPr>
               <w:t>الميزة / نقطة الاختبار</w:t>
             </w:r>
@@ -136,6 +213,7 @@
             <w:r>
               <w:rPr>
                 <w:b/>
+                <w:sz w:val="20"/>
               </w:rPr>
               <w:t>#</w:t>
             </w:r>
@@ -168,7 +246,7 @@
               <w:bidi/>
             </w:pPr>
             <w:r>
-              <w:t>عرض قائمة كل المنصات (`/platforms`)</w:t>
+              <w:t>عرض قائمة كل المنصات</w:t>
             </w:r>
           </w:p>
         </w:tc>
@@ -214,7 +292,7 @@
               <w:bidi/>
             </w:pPr>
             <w:r>
-              <w:t>فتح صفحة تفاصيل منصة (`/platforms/{id}`)</w:t>
+              <w:t>فتح صفحة تفاصيل منصة</w:t>
             </w:r>
           </w:p>
         </w:tc>
@@ -259,7 +337,7 @@
               <w:bidi/>
             </w:pPr>
             <w:r>
-              <w:t>إضافة منصة جديدة (`/platforms/add`) — اسم، مالك، بريد، كلمة مرور</w:t>
+              <w:t>إضافة منصة جديدة — اسم، مالك، بريد، كلمة مرور</w:t>
             </w:r>
           </w:p>
         </w:tc>
@@ -540,9 +618,7 @@
             <w:r>
               <w:rPr>
                 <w:b/>
-                <w:sz w:val="34"/>
               </w:rPr>
-              <w:t>☐</w:t>
             </w:r>
           </w:p>
         </w:tc>
@@ -558,6 +634,7 @@
             <w:r>
               <w:rPr>
                 <w:b/>
+                <w:sz w:val="20"/>
               </w:rPr>
               <w:t>الميزة / نقطة الاختبار</w:t>
             </w:r>
@@ -575,6 +652,7 @@
             <w:r>
               <w:rPr>
                 <w:b/>
+                <w:sz w:val="20"/>
               </w:rPr>
               <w:t>#</w:t>
             </w:r>
@@ -607,7 +685,7 @@
               <w:bidi/>
             </w:pPr>
             <w:r>
-              <w:t>عرض لوحة التحكم الرئيسية (`/dashboard`)</w:t>
+              <w:t>عرض لوحة التحكم الرئيسية</w:t>
             </w:r>
           </w:p>
         </w:tc>
@@ -698,7 +776,7 @@
               <w:bidi/>
             </w:pPr>
             <w:r>
-              <w:t>فتح التقارير (`/reports`)</w:t>
+              <w:t>فتح التقارير</w:t>
             </w:r>
           </w:p>
         </w:tc>
@@ -797,9 +875,7 @@
             <w:r>
               <w:rPr>
                 <w:b/>
-                <w:sz w:val="34"/>
               </w:rPr>
-              <w:t>☐</w:t>
             </w:r>
           </w:p>
         </w:tc>
@@ -815,6 +891,7 @@
             <w:r>
               <w:rPr>
                 <w:b/>
+                <w:sz w:val="20"/>
               </w:rPr>
               <w:t>الميزة / نقطة الاختبار</w:t>
             </w:r>
@@ -832,6 +909,7 @@
             <w:r>
               <w:rPr>
                 <w:b/>
+                <w:sz w:val="20"/>
               </w:rPr>
               <w:t>#</w:t>
             </w:r>
@@ -864,7 +942,7 @@
               <w:bidi/>
             </w:pPr>
             <w:r>
-              <w:t>إدارة صفحة الهبوط (`/landing-page`)</w:t>
+              <w:t>إدارة صفحة الهبوط</w:t>
             </w:r>
           </w:p>
         </w:tc>
@@ -910,7 +988,7 @@
               <w:bidi/>
             </w:pPr>
             <w:r>
-              <w:t>إدارة الصفحات الثابتة (`/static-pages`)</w:t>
+              <w:t>إدارة الصفحات الثابتة</w:t>
             </w:r>
           </w:p>
         </w:tc>
@@ -955,7 +1033,7 @@
               <w:bidi/>
             </w:pPr>
             <w:r>
-              <w:t>إدارة الأسئلة الشائعة (`/faq`)</w:t>
+              <w:t>إدارة الأسئلة الشائعة</w:t>
             </w:r>
           </w:p>
         </w:tc>
@@ -1001,7 +1079,7 @@
               <w:bidi/>
             </w:pPr>
             <w:r>
-              <w:t>إدارة الإعلانات والبانرات (`/announcements`)</w:t>
+              <w:t>إدارة الإعلانات والبانرات</w:t>
             </w:r>
           </w:p>
         </w:tc>
@@ -1046,7 +1124,7 @@
               <w:bidi/>
             </w:pPr>
             <w:r>
-              <w:t>إدارة الوسائط العامة (`/public-media`)</w:t>
+              <w:t>إدارة الوسائط العامة</w:t>
             </w:r>
           </w:p>
         </w:tc>
@@ -1092,7 +1170,7 @@
               <w:bidi/>
             </w:pPr>
             <w:r>
-              <w:t>إدارة الروابط الخارجية (`/external-links`)</w:t>
+              <w:t>إدارة الروابط الخارجية</w:t>
             </w:r>
           </w:p>
         </w:tc>
@@ -1145,9 +1223,7 @@
             <w:r>
               <w:rPr>
                 <w:b/>
-                <w:sz w:val="34"/>
               </w:rPr>
-              <w:t>☐</w:t>
             </w:r>
           </w:p>
         </w:tc>
@@ -1163,6 +1239,7 @@
             <w:r>
               <w:rPr>
                 <w:b/>
+                <w:sz w:val="20"/>
               </w:rPr>
               <w:t>الميزة / نقطة الاختبار</w:t>
             </w:r>
@@ -1180,6 +1257,7 @@
             <w:r>
               <w:rPr>
                 <w:b/>
+                <w:sz w:val="20"/>
               </w:rPr>
               <w:t>#</w:t>
             </w:r>
@@ -1212,7 +1290,7 @@
               <w:bidi/>
             </w:pPr>
             <w:r>
-              <w:t>فتح التكاملات (`/integrations`) — واتساب، Twilio، إلخ</w:t>
+              <w:t>فتح التكاملات — واتساب، Twilio، إلخ</w:t>
             </w:r>
           </w:p>
         </w:tc>
@@ -1258,7 +1336,7 @@
               <w:bidi/>
             </w:pPr>
             <w:r>
-              <w:t>فتح الإعدادات (`/settings`)</w:t>
+              <w:t>فتح الإعدادات</w:t>
             </w:r>
           </w:p>
         </w:tc>
@@ -1303,7 +1381,7 @@
               <w:bidi/>
             </w:pPr>
             <w:r>
-              <w:t>فتح النسخ الاحتياطي (`/backup`)</w:t>
+              <w:t>فتح النسخ الاحتياطي</w:t>
             </w:r>
           </w:p>
         </w:tc>
@@ -1349,7 +1427,7 @@
               <w:bidi/>
             </w:pPr>
             <w:r>
-              <w:t>عرض سجلات النشاط (`/activity-logs`)</w:t>
+              <w:t>عرض سجلات النشاط</w:t>
             </w:r>
           </w:p>
         </w:tc>
@@ -1394,7 +1472,7 @@
               <w:bidi/>
             </w:pPr>
             <w:r>
-              <w:t>عرض أداء الخوادم (`/servers-performance`)</w:t>
+              <w:t>عرض أداء الخوادم</w:t>
             </w:r>
           </w:p>
         </w:tc>
@@ -1446,9 +1524,7 @@
             <w:r>
               <w:rPr>
                 <w:b/>
-                <w:sz w:val="34"/>
               </w:rPr>
-              <w:t>☐</w:t>
             </w:r>
           </w:p>
         </w:tc>
@@ -1464,6 +1540,7 @@
             <w:r>
               <w:rPr>
                 <w:b/>
+                <w:sz w:val="20"/>
               </w:rPr>
               <w:t>الميزة / نقطة الاختبار</w:t>
             </w:r>
@@ -1481,6 +1558,7 @@
             <w:r>
               <w:rPr>
                 <w:b/>
+                <w:sz w:val="20"/>
               </w:rPr>
               <w:t>#</w:t>
             </w:r>
@@ -1513,7 +1591,7 @@
               <w:bidi/>
             </w:pPr>
             <w:r>
-              <w:t>فتح صندوق الرسائل (`/messages`)</w:t>
+              <w:t>فتح صندوق الرسائل</w:t>
             </w:r>
           </w:p>
         </w:tc>
@@ -1650,7 +1728,7 @@
               <w:bidi/>
             </w:pPr>
             <w:r>
-              <w:t>عرض الإشعارات (`/notifications`)</w:t>
+              <w:t>عرض الإشعارات</w:t>
             </w:r>
           </w:p>
         </w:tc>
@@ -1703,9 +1781,7 @@
             <w:r>
               <w:rPr>
                 <w:b/>
-                <w:sz w:val="34"/>
               </w:rPr>
-              <w:t>☐</w:t>
             </w:r>
           </w:p>
         </w:tc>
@@ -1721,6 +1797,7 @@
             <w:r>
               <w:rPr>
                 <w:b/>
+                <w:sz w:val="20"/>
               </w:rPr>
               <w:t>الميزة / نقطة الاختبار</w:t>
             </w:r>
@@ -1738,6 +1815,7 @@
             <w:r>
               <w:rPr>
                 <w:b/>
+                <w:sz w:val="20"/>
               </w:rPr>
               <w:t>#</w:t>
             </w:r>
@@ -1770,7 +1848,7 @@
               <w:bidi/>
             </w:pPr>
             <w:r>
-              <w:t>محاولة الدخول بحساب ضيف → يُرفض من `/login`</w:t>
+              <w:t>محاولة الدخول بحساب ضيف → يُرفض من</w:t>
             </w:r>
           </w:p>
         </w:tc>
@@ -1938,9 +2016,7 @@
             <w:r>
               <w:rPr>
                 <w:b/>
-                <w:sz w:val="34"/>
               </w:rPr>
-              <w:t>☐</w:t>
             </w:r>
           </w:p>
         </w:tc>
@@ -1956,6 +2032,7 @@
             <w:r>
               <w:rPr>
                 <w:b/>
+                <w:sz w:val="20"/>
               </w:rPr>
               <w:t>الميزة / نقطة الاختبار</w:t>
             </w:r>
@@ -1973,6 +2050,7 @@
             <w:r>
               <w:rPr>
                 <w:b/>
+                <w:sz w:val="20"/>
               </w:rPr>
               <w:t>#</w:t>
             </w:r>
@@ -2005,7 +2083,7 @@
               <w:bidi/>
             </w:pPr>
             <w:r>
-              <w:t>عرض لوحة تحكم المنصة (`/platform/dashboard`)</w:t>
+              <w:t>عرض لوحة تحكم المنصة</w:t>
             </w:r>
           </w:p>
         </w:tc>
@@ -2148,9 +2226,7 @@
             <w:r>
               <w:rPr>
                 <w:b/>
-                <w:sz w:val="34"/>
               </w:rPr>
-              <w:t>☐</w:t>
             </w:r>
           </w:p>
         </w:tc>
@@ -2166,6 +2242,7 @@
             <w:r>
               <w:rPr>
                 <w:b/>
+                <w:sz w:val="20"/>
               </w:rPr>
               <w:t>الميزة / نقطة الاختبار</w:t>
             </w:r>
@@ -2183,6 +2260,7 @@
             <w:r>
               <w:rPr>
                 <w:b/>
+                <w:sz w:val="20"/>
               </w:rPr>
               <w:t>#</w:t>
             </w:r>
@@ -2215,7 +2293,7 @@
               <w:bidi/>
             </w:pPr>
             <w:r>
-              <w:t>عرض كل فعاليات المنصة (`/platform/events`)</w:t>
+              <w:t>عرض كل فعاليات المنصة</w:t>
             </w:r>
           </w:p>
         </w:tc>
@@ -2352,7 +2430,7 @@
               <w:bidi/>
             </w:pPr>
             <w:r>
-              <w:t>فتح تفاصيل فعالية (`/platform/events/{id}`)</w:t>
+              <w:t>فتح تفاصيل فعالية</w:t>
             </w:r>
           </w:p>
         </w:tc>
@@ -2449,9 +2527,7 @@
             <w:r>
               <w:rPr>
                 <w:b/>
-                <w:sz w:val="34"/>
               </w:rPr>
-              <w:t>☐</w:t>
             </w:r>
           </w:p>
         </w:tc>
@@ -2467,6 +2543,7 @@
             <w:r>
               <w:rPr>
                 <w:b/>
+                <w:sz w:val="20"/>
               </w:rPr>
               <w:t>الميزة / نقطة الاختبار</w:t>
             </w:r>
@@ -2484,6 +2561,7 @@
             <w:r>
               <w:rPr>
                 <w:b/>
+                <w:sz w:val="20"/>
               </w:rPr>
               <w:t>#</w:t>
             </w:r>
@@ -2516,7 +2594,7 @@
               <w:bidi/>
             </w:pPr>
             <w:r>
-              <w:t>عرض الأعضاء (`/platform/users`)</w:t>
+              <w:t>عرض الأعضاء</w:t>
             </w:r>
           </w:p>
         </w:tc>
@@ -2750,9 +2828,7 @@
             <w:r>
               <w:rPr>
                 <w:b/>
-                <w:sz w:val="34"/>
               </w:rPr>
-              <w:t>☐</w:t>
             </w:r>
           </w:p>
         </w:tc>
@@ -2768,6 +2844,7 @@
             <w:r>
               <w:rPr>
                 <w:b/>
+                <w:sz w:val="20"/>
               </w:rPr>
               <w:t>الميزة / نقطة الاختبار</w:t>
             </w:r>
@@ -2785,6 +2862,7 @@
             <w:r>
               <w:rPr>
                 <w:b/>
+                <w:sz w:val="20"/>
               </w:rPr>
               <w:t>#</w:t>
             </w:r>
@@ -2817,7 +2895,7 @@
               <w:bidi/>
             </w:pPr>
             <w:r>
-              <w:t>عرض ضيوف المنصة (`/platform/guests`)</w:t>
+              <w:t>عرض ضيوف المنصة</w:t>
             </w:r>
           </w:p>
         </w:tc>
@@ -2863,7 +2941,7 @@
               <w:bidi/>
             </w:pPr>
             <w:r>
-              <w:t>فتح التقارير (`/platform/reports`)</w:t>
+              <w:t>فتح التقارير</w:t>
             </w:r>
           </w:p>
         </w:tc>
@@ -2960,9 +3038,7 @@
             <w:r>
               <w:rPr>
                 <w:b/>
-                <w:sz w:val="34"/>
               </w:rPr>
-              <w:t>☐</w:t>
             </w:r>
           </w:p>
         </w:tc>
@@ -2978,6 +3054,7 @@
             <w:r>
               <w:rPr>
                 <w:b/>
+                <w:sz w:val="20"/>
               </w:rPr>
               <w:t>الميزة / نقطة الاختبار</w:t>
             </w:r>
@@ -2995,6 +3072,7 @@
             <w:r>
               <w:rPr>
                 <w:b/>
+                <w:sz w:val="20"/>
               </w:rPr>
               <w:t>#</w:t>
             </w:r>
@@ -3027,7 +3105,7 @@
               <w:bidi/>
             </w:pPr>
             <w:r>
-              <w:t>فتح إعدادات المنصة (`/platform/settings`)</w:t>
+              <w:t>فتح إعدادات المنصة</w:t>
             </w:r>
           </w:p>
         </w:tc>
@@ -3217,9 +3295,7 @@
             <w:r>
               <w:rPr>
                 <w:b/>
-                <w:sz w:val="34"/>
               </w:rPr>
-              <w:t>☐</w:t>
             </w:r>
           </w:p>
         </w:tc>
@@ -3235,6 +3311,7 @@
             <w:r>
               <w:rPr>
                 <w:b/>
+                <w:sz w:val="20"/>
               </w:rPr>
               <w:t>الميزة / نقطة الاختبار</w:t>
             </w:r>
@@ -3252,6 +3329,7 @@
             <w:r>
               <w:rPr>
                 <w:b/>
+                <w:sz w:val="20"/>
               </w:rPr>
               <w:t>#</w:t>
             </w:r>
@@ -3284,7 +3362,7 @@
               <w:bidi/>
             </w:pPr>
             <w:r>
-              <w:t>عرض الرسائل (`/platform/messages`)</w:t>
+              <w:t>عرض الرسائل</w:t>
             </w:r>
           </w:p>
         </w:tc>
@@ -3375,7 +3453,7 @@
               <w:bidi/>
             </w:pPr>
             <w:r>
-              <w:t>عرض الإشعارات (`/platform/notifications`)</w:t>
+              <w:t>عرض الإشعارات</w:t>
             </w:r>
           </w:p>
         </w:tc>
@@ -3474,9 +3552,7 @@
             <w:r>
               <w:rPr>
                 <w:b/>
-                <w:sz w:val="34"/>
               </w:rPr>
-              <w:t>☐</w:t>
             </w:r>
           </w:p>
         </w:tc>
@@ -3492,6 +3568,7 @@
             <w:r>
               <w:rPr>
                 <w:b/>
+                <w:sz w:val="20"/>
               </w:rPr>
               <w:t>الميزة / نقطة الاختبار</w:t>
             </w:r>
@@ -3509,6 +3586,7 @@
             <w:r>
               <w:rPr>
                 <w:b/>
+                <w:sz w:val="20"/>
               </w:rPr>
               <w:t>#</w:t>
             </w:r>
@@ -3541,7 +3619,7 @@
               <w:bidi/>
             </w:pPr>
             <w:r>
-              <w:t>محاولة فتح `/platforms` (إدارة كل المنصات) → مرفوض أو غير ظاهر</w:t>
+              <w:t>محاولة فتح (إدارة كل المنصات) → مرفوض أو غير ظاهر</w:t>
             </w:r>
           </w:p>
         </w:tc>
@@ -3587,7 +3665,7 @@
               <w:bidi/>
             </w:pPr>
             <w:r>
-              <w:t>محاولة فتح `/settings` (إعدادات النظام) → مرفوض</w:t>
+              <w:t>محاولة فتح (إعدادات النظام) → مرفوض</w:t>
             </w:r>
           </w:p>
         </w:tc>
@@ -3800,9 +3878,7 @@
             <w:r>
               <w:rPr>
                 <w:b/>
-                <w:sz w:val="34"/>
               </w:rPr>
-              <w:t>☐</w:t>
             </w:r>
           </w:p>
         </w:tc>
@@ -3818,6 +3894,7 @@
             <w:r>
               <w:rPr>
                 <w:b/>
+                <w:sz w:val="20"/>
               </w:rPr>
               <w:t>الميزة / نقطة الاختبار</w:t>
             </w:r>
@@ -3835,6 +3912,7 @@
             <w:r>
               <w:rPr>
                 <w:b/>
+                <w:sz w:val="20"/>
               </w:rPr>
               <w:t>#</w:t>
             </w:r>
@@ -3867,7 +3945,7 @@
               <w:bidi/>
             </w:pPr>
             <w:r>
-              <w:t>عرض لوحة التحكم (`/event-manager/dashboard`)</w:t>
+              <w:t>عرض لوحة التحكم</w:t>
             </w:r>
           </w:p>
         </w:tc>
@@ -3958,7 +4036,7 @@
               <w:bidi/>
             </w:pPr>
             <w:r>
-              <w:t>فتح تفاصيل فعالية (`/event-manager/events/{id}`)</w:t>
+              <w:t>فتح تفاصيل فعالية</w:t>
             </w:r>
           </w:p>
         </w:tc>
@@ -4010,9 +4088,7 @@
             <w:r>
               <w:rPr>
                 <w:b/>
-                <w:sz w:val="34"/>
               </w:rPr>
-              <w:t>☐</w:t>
             </w:r>
           </w:p>
         </w:tc>
@@ -4028,6 +4104,7 @@
             <w:r>
               <w:rPr>
                 <w:b/>
+                <w:sz w:val="20"/>
               </w:rPr>
               <w:t>الميزة / نقطة الاختبار</w:t>
             </w:r>
@@ -4045,6 +4122,7 @@
             <w:r>
               <w:rPr>
                 <w:b/>
+                <w:sz w:val="20"/>
               </w:rPr>
               <w:t>#</w:t>
             </w:r>
@@ -4077,7 +4155,7 @@
               <w:bidi/>
             </w:pPr>
             <w:r>
-              <w:t>إضافة قسم (`/events/{id}/groups` أو الأقسام)</w:t>
+              <w:t>إضافة قسم (الأقسام)</w:t>
             </w:r>
           </w:p>
         </w:tc>
@@ -4214,7 +4292,7 @@
               <w:bidi/>
             </w:pPr>
             <w:r>
-              <w:t>إضافة بند في الجدول الزمني (`/events/{id}/schedule`)</w:t>
+              <w:t>إضافة بند في الجدول الزمني</w:t>
             </w:r>
           </w:p>
         </w:tc>
@@ -4311,9 +4389,7 @@
             <w:r>
               <w:rPr>
                 <w:b/>
-                <w:sz w:val="34"/>
               </w:rPr>
-              <w:t>☐</w:t>
             </w:r>
           </w:p>
         </w:tc>
@@ -4329,6 +4405,7 @@
             <w:r>
               <w:rPr>
                 <w:b/>
+                <w:sz w:val="20"/>
               </w:rPr>
               <w:t>الميزة / نقطة الاختبار</w:t>
             </w:r>
@@ -4346,6 +4423,7 @@
             <w:r>
               <w:rPr>
                 <w:b/>
+                <w:sz w:val="20"/>
               </w:rPr>
               <w:t>#</w:t>
             </w:r>
@@ -4378,7 +4456,7 @@
               <w:bidi/>
             </w:pPr>
             <w:r>
-              <w:t>عرض ضيوف الفعالية (`/event-manager/events/{id}/guests`)</w:t>
+              <w:t>عرض ضيوف الفعالية</w:t>
             </w:r>
           </w:p>
         </w:tc>
@@ -4659,9 +4737,7 @@
             <w:r>
               <w:rPr>
                 <w:b/>
-                <w:sz w:val="34"/>
               </w:rPr>
-              <w:t>☐</w:t>
             </w:r>
           </w:p>
         </w:tc>
@@ -4677,6 +4753,7 @@
             <w:r>
               <w:rPr>
                 <w:b/>
+                <w:sz w:val="20"/>
               </w:rPr>
               <w:t>الميزة / نقطة الاختبار</w:t>
             </w:r>
@@ -4694,6 +4771,7 @@
             <w:r>
               <w:rPr>
                 <w:b/>
+                <w:sz w:val="20"/>
               </w:rPr>
               <w:t>#</w:t>
             </w:r>
@@ -4726,7 +4804,7 @@
               <w:bidi/>
             </w:pPr>
             <w:r>
-              <w:t>فتح صفحة الدعوات (`/event-manager/events/{id}/invitations`)</w:t>
+              <w:t>فتح صفحة الدعوات</w:t>
             </w:r>
           </w:p>
         </w:tc>
@@ -4908,7 +4986,7 @@
               <w:bidi/>
             </w:pPr>
             <w:r>
-              <w:t>التحقق من وصول رابط فريد `/i/{token}` لكل ضيف</w:t>
+              <w:t>التحقق من وصول رابط فريد لكل ضيف</w:t>
             </w:r>
           </w:p>
         </w:tc>
@@ -4960,9 +5038,7 @@
             <w:r>
               <w:rPr>
                 <w:b/>
-                <w:sz w:val="34"/>
               </w:rPr>
-              <w:t>☐</w:t>
             </w:r>
           </w:p>
         </w:tc>
@@ -4978,6 +5054,7 @@
             <w:r>
               <w:rPr>
                 <w:b/>
+                <w:sz w:val="20"/>
               </w:rPr>
               <w:t>الميزة / نقطة الاختبار</w:t>
             </w:r>
@@ -4995,6 +5072,7 @@
             <w:r>
               <w:rPr>
                 <w:b/>
+                <w:sz w:val="20"/>
               </w:rPr>
               <w:t>#</w:t>
             </w:r>
@@ -5027,7 +5105,7 @@
               <w:bidi/>
             </w:pPr>
             <w:r>
-              <w:t>فتح توزيع المقاعد (`/event-manager/events/{id}/seating`)</w:t>
+              <w:t>فتح توزيع المقاعد</w:t>
             </w:r>
           </w:p>
         </w:tc>
@@ -5261,9 +5339,7 @@
             <w:r>
               <w:rPr>
                 <w:b/>
-                <w:sz w:val="34"/>
               </w:rPr>
-              <w:t>☐</w:t>
             </w:r>
           </w:p>
         </w:tc>
@@ -5279,6 +5355,7 @@
             <w:r>
               <w:rPr>
                 <w:b/>
+                <w:sz w:val="20"/>
               </w:rPr>
               <w:t>الميزة / نقطة الاختبار</w:t>
             </w:r>
@@ -5296,6 +5373,7 @@
             <w:r>
               <w:rPr>
                 <w:b/>
+                <w:sz w:val="20"/>
               </w:rPr>
               <w:t>#</w:t>
             </w:r>
@@ -5328,7 +5406,7 @@
               <w:bidi/>
             </w:pPr>
             <w:r>
-              <w:t>فتح صفحة البث (`/event-manager/events/{id}/broadcast`)</w:t>
+              <w:t>فتح صفحة البث</w:t>
             </w:r>
           </w:p>
         </w:tc>
@@ -5601,7 +5679,7 @@
               <w:bidi/>
             </w:pPr>
             <w:r>
-              <w:t>نسخ رابط البث العام `/live/{token}`</w:t>
+              <w:t>نسخ رابط البث العام</w:t>
             </w:r>
           </w:p>
         </w:tc>
@@ -5653,9 +5731,7 @@
             <w:r>
               <w:rPr>
                 <w:b/>
-                <w:sz w:val="34"/>
               </w:rPr>
-              <w:t>☐</w:t>
             </w:r>
           </w:p>
         </w:tc>
@@ -5671,6 +5747,7 @@
             <w:r>
               <w:rPr>
                 <w:b/>
+                <w:sz w:val="20"/>
               </w:rPr>
               <w:t>الميزة / نقطة الاختبار</w:t>
             </w:r>
@@ -5688,6 +5765,7 @@
             <w:r>
               <w:rPr>
                 <w:b/>
+                <w:sz w:val="20"/>
               </w:rPr>
               <w:t>#</w:t>
             </w:r>
@@ -5819,9 +5897,7 @@
             <w:r>
               <w:rPr>
                 <w:b/>
-                <w:sz w:val="34"/>
               </w:rPr>
-              <w:t>☐</w:t>
             </w:r>
           </w:p>
         </w:tc>
@@ -5837,6 +5913,7 @@
             <w:r>
               <w:rPr>
                 <w:b/>
+                <w:sz w:val="20"/>
               </w:rPr>
               <w:t>الميزة / نقطة الاختبار</w:t>
             </w:r>
@@ -5854,6 +5931,7 @@
             <w:r>
               <w:rPr>
                 <w:b/>
+                <w:sz w:val="20"/>
               </w:rPr>
               <w:t>#</w:t>
             </w:r>
@@ -5886,7 +5964,7 @@
               <w:bidi/>
             </w:pPr>
             <w:r>
-              <w:t>فتح «المنسقون ومدراء الدخول» (`/event-manager/staff`)</w:t>
+              <w:t>فتح «المنسقون ومدراء الدخول»</w:t>
             </w:r>
           </w:p>
         </w:tc>
@@ -6120,9 +6198,7 @@
             <w:r>
               <w:rPr>
                 <w:b/>
-                <w:sz w:val="34"/>
               </w:rPr>
-              <w:t>☐</w:t>
             </w:r>
           </w:p>
         </w:tc>
@@ -6138,6 +6214,7 @@
             <w:r>
               <w:rPr>
                 <w:b/>
+                <w:sz w:val="20"/>
               </w:rPr>
               <w:t>الميزة / نقطة الاختبار</w:t>
             </w:r>
@@ -6155,6 +6232,7 @@
             <w:r>
               <w:rPr>
                 <w:b/>
+                <w:sz w:val="20"/>
               </w:rPr>
               <w:t>#</w:t>
             </w:r>
@@ -6187,7 +6265,7 @@
               <w:bidi/>
             </w:pPr>
             <w:r>
-              <w:t>عرض فريق العمل (`/event-manager/team`)</w:t>
+              <w:t>عرض فريق العمل</w:t>
             </w:r>
           </w:p>
         </w:tc>
@@ -6233,7 +6311,7 @@
               <w:bidi/>
             </w:pPr>
             <w:r>
-              <w:t>فتح الرسائل (`/event-manager/messages`)</w:t>
+              <w:t>فتح الرسائل</w:t>
             </w:r>
           </w:p>
         </w:tc>
@@ -6603,9 +6681,7 @@
             <w:r>
               <w:rPr>
                 <w:b/>
-                <w:sz w:val="34"/>
               </w:rPr>
-              <w:t>☐</w:t>
             </w:r>
           </w:p>
         </w:tc>
@@ -6621,6 +6697,7 @@
             <w:r>
               <w:rPr>
                 <w:b/>
+                <w:sz w:val="20"/>
               </w:rPr>
               <w:t>الميزة / نقطة الاختبار</w:t>
             </w:r>
@@ -6638,6 +6715,7 @@
             <w:r>
               <w:rPr>
                 <w:b/>
+                <w:sz w:val="20"/>
               </w:rPr>
               <w:t>#</w:t>
             </w:r>
@@ -6670,7 +6748,7 @@
               <w:bidi/>
             </w:pPr>
             <w:r>
-              <w:t>فتح صفحة الإشعارات (`/event-manager/notifications`)</w:t>
+              <w:t>فتح صفحة الإشعارات</w:t>
             </w:r>
           </w:p>
         </w:tc>
@@ -6860,9 +6938,7 @@
             <w:r>
               <w:rPr>
                 <w:b/>
-                <w:sz w:val="34"/>
               </w:rPr>
-              <w:t>☐</w:t>
             </w:r>
           </w:p>
         </w:tc>
@@ -6878,6 +6954,7 @@
             <w:r>
               <w:rPr>
                 <w:b/>
+                <w:sz w:val="20"/>
               </w:rPr>
               <w:t>الميزة / نقطة الاختبار</w:t>
             </w:r>
@@ -6895,6 +6972,7 @@
             <w:r>
               <w:rPr>
                 <w:b/>
+                <w:sz w:val="20"/>
               </w:rPr>
               <w:t>#</w:t>
             </w:r>
@@ -6927,7 +7005,7 @@
               <w:bidi/>
             </w:pPr>
             <w:r>
-              <w:t>فتح صفحة التقدم (`/event-manager/events/{id}/progress`)</w:t>
+              <w:t>فتح صفحة التقدم</w:t>
             </w:r>
           </w:p>
         </w:tc>
@@ -7026,9 +7104,7 @@
             <w:r>
               <w:rPr>
                 <w:b/>
-                <w:sz w:val="34"/>
               </w:rPr>
-              <w:t>☐</w:t>
             </w:r>
           </w:p>
         </w:tc>
@@ -7044,6 +7120,7 @@
             <w:r>
               <w:rPr>
                 <w:b/>
+                <w:sz w:val="20"/>
               </w:rPr>
               <w:t>الميزة / نقطة الاختبار</w:t>
             </w:r>
@@ -7061,6 +7138,7 @@
             <w:r>
               <w:rPr>
                 <w:b/>
+                <w:sz w:val="20"/>
               </w:rPr>
               <w:t>#</w:t>
             </w:r>
@@ -7326,9 +7404,7 @@
             <w:r>
               <w:rPr>
                 <w:b/>
-                <w:sz w:val="34"/>
               </w:rPr>
-              <w:t>☐</w:t>
             </w:r>
           </w:p>
         </w:tc>
@@ -7344,6 +7420,7 @@
             <w:r>
               <w:rPr>
                 <w:b/>
+                <w:sz w:val="20"/>
               </w:rPr>
               <w:t>الميزة / نقطة الاختبار</w:t>
             </w:r>
@@ -7361,6 +7438,7 @@
             <w:r>
               <w:rPr>
                 <w:b/>
+                <w:sz w:val="20"/>
               </w:rPr>
               <w:t>#</w:t>
             </w:r>
@@ -7393,7 +7471,7 @@
               <w:bidi/>
             </w:pPr>
             <w:r>
-              <w:t>عرض لوحة المنظم (`/event-organizer/dashboard`)</w:t>
+              <w:t>عرض لوحة المنظم</w:t>
             </w:r>
           </w:p>
         </w:tc>
@@ -7465,7 +7543,7 @@
         <w:pStyle w:val="Heading3"/>
       </w:pPr>
       <w:r>
-        <w:t>الضيوف (يتطلب `perm_edit_guests`)</w:t>
+        <w:t>الضيوف</w:t>
       </w:r>
     </w:p>
     <w:tbl>
@@ -7492,9 +7570,7 @@
             <w:r>
               <w:rPr>
                 <w:b/>
-                <w:sz w:val="34"/>
               </w:rPr>
-              <w:t>☐</w:t>
             </w:r>
           </w:p>
         </w:tc>
@@ -7510,6 +7586,7 @@
             <w:r>
               <w:rPr>
                 <w:b/>
+                <w:sz w:val="20"/>
               </w:rPr>
               <w:t>الميزة / نقطة الاختبار</w:t>
             </w:r>
@@ -7527,6 +7604,7 @@
             <w:r>
               <w:rPr>
                 <w:b/>
+                <w:sz w:val="20"/>
               </w:rPr>
               <w:t>#</w:t>
             </w:r>
@@ -7559,7 +7637,7 @@
               <w:bidi/>
             </w:pPr>
             <w:r>
-              <w:t>عرض الضيوف (`/event-organizer/guests` أو ضمن فعالية)</w:t>
+              <w:t>عرض الضيوف (ضمن فعالية)</w:t>
             </w:r>
           </w:p>
         </w:tc>
@@ -7722,7 +7800,7 @@
         <w:pStyle w:val="Heading3"/>
       </w:pPr>
       <w:r>
-        <w:t>الدعوات (يتطلب `perm_send_messages`)</w:t>
+        <w:t>الدعوات</w:t>
       </w:r>
     </w:p>
     <w:tbl>
@@ -7749,9 +7827,7 @@
             <w:r>
               <w:rPr>
                 <w:b/>
-                <w:sz w:val="34"/>
               </w:rPr>
-              <w:t>☐</w:t>
             </w:r>
           </w:p>
         </w:tc>
@@ -7767,6 +7843,7 @@
             <w:r>
               <w:rPr>
                 <w:b/>
+                <w:sz w:val="20"/>
               </w:rPr>
               <w:t>الميزة / نقطة الاختبار</w:t>
             </w:r>
@@ -7784,6 +7861,7 @@
             <w:r>
               <w:rPr>
                 <w:b/>
+                <w:sz w:val="20"/>
               </w:rPr>
               <w:t>#</w:t>
             </w:r>
@@ -7816,7 +7894,7 @@
               <w:bidi/>
             </w:pPr>
             <w:r>
-              <w:t>فتح الدعوات (`/event-organizer/invitations`)</w:t>
+              <w:t>فتح الدعوات</w:t>
             </w:r>
           </w:p>
         </w:tc>
@@ -7979,7 +8057,7 @@
         <w:pStyle w:val="Heading3"/>
       </w:pPr>
       <w:r>
-        <w:t>تسجيل الحضور (يتطلب `perm_scan_qr`)</w:t>
+        <w:t>تسجيل الحضور</w:t>
       </w:r>
     </w:p>
     <w:tbl>
@@ -8006,9 +8084,7 @@
             <w:r>
               <w:rPr>
                 <w:b/>
-                <w:sz w:val="34"/>
               </w:rPr>
-              <w:t>☐</w:t>
             </w:r>
           </w:p>
         </w:tc>
@@ -8024,6 +8100,7 @@
             <w:r>
               <w:rPr>
                 <w:b/>
+                <w:sz w:val="20"/>
               </w:rPr>
               <w:t>الميزة / نقطة الاختبار</w:t>
             </w:r>
@@ -8041,6 +8118,7 @@
             <w:r>
               <w:rPr>
                 <w:b/>
+                <w:sz w:val="20"/>
               </w:rPr>
               <w:t>#</w:t>
             </w:r>
@@ -8073,7 +8151,7 @@
               <w:bidi/>
             </w:pPr>
             <w:r>
-              <w:t>فتح تسجيل الحضور (`/event-organizer/check-in`)</w:t>
+              <w:t>فتح تسجيل الحضور</w:t>
             </w:r>
           </w:p>
         </w:tc>
@@ -8263,9 +8341,7 @@
             <w:r>
               <w:rPr>
                 <w:b/>
-                <w:sz w:val="34"/>
               </w:rPr>
-              <w:t>☐</w:t>
             </w:r>
           </w:p>
         </w:tc>
@@ -8281,6 +8357,7 @@
             <w:r>
               <w:rPr>
                 <w:b/>
+                <w:sz w:val="20"/>
               </w:rPr>
               <w:t>الميزة / نقطة الاختبار</w:t>
             </w:r>
@@ -8298,6 +8375,7 @@
             <w:r>
               <w:rPr>
                 <w:b/>
+                <w:sz w:val="20"/>
               </w:rPr>
               <w:t>#</w:t>
             </w:r>
@@ -8330,7 +8408,7 @@
               <w:bidi/>
             </w:pPr>
             <w:r>
-              <w:t>فتح البث (`/event-organizer/broadcast`)</w:t>
+              <w:t>فتح البث</w:t>
             </w:r>
           </w:p>
         </w:tc>
@@ -8473,9 +8551,7 @@
             <w:r>
               <w:rPr>
                 <w:b/>
-                <w:sz w:val="34"/>
               </w:rPr>
-              <w:t>☐</w:t>
             </w:r>
           </w:p>
         </w:tc>
@@ -8491,6 +8567,7 @@
             <w:r>
               <w:rPr>
                 <w:b/>
+                <w:sz w:val="20"/>
               </w:rPr>
               <w:t>الميزة / نقطة الاختبار</w:t>
             </w:r>
@@ -8508,6 +8585,7 @@
             <w:r>
               <w:rPr>
                 <w:b/>
+                <w:sz w:val="20"/>
               </w:rPr>
               <w:t>#</w:t>
             </w:r>
@@ -8540,7 +8618,7 @@
               <w:bidi/>
             </w:pPr>
             <w:r>
-              <w:t>فتح توزيع المقاعد (`/event-organizer/seating`)</w:t>
+              <w:t>فتح توزيع المقاعد</w:t>
             </w:r>
           </w:p>
         </w:tc>
@@ -8683,9 +8761,7 @@
             <w:r>
               <w:rPr>
                 <w:b/>
-                <w:sz w:val="34"/>
               </w:rPr>
-              <w:t>☐</w:t>
             </w:r>
           </w:p>
         </w:tc>
@@ -8701,6 +8777,7 @@
             <w:r>
               <w:rPr>
                 <w:b/>
+                <w:sz w:val="20"/>
               </w:rPr>
               <w:t>الميزة / نقطة الاختبار</w:t>
             </w:r>
@@ -8718,6 +8795,7 @@
             <w:r>
               <w:rPr>
                 <w:b/>
+                <w:sz w:val="20"/>
               </w:rPr>
               <w:t>#</w:t>
             </w:r>
@@ -8750,7 +8828,7 @@
               <w:bidi/>
             </w:pPr>
             <w:r>
-              <w:t>فتح الرسائل (`/event-organizer/messages`) — إن مُنحت الصلاحية</w:t>
+              <w:t>فتح الرسائل — إن مُنحت الصلاحية</w:t>
             </w:r>
           </w:p>
         </w:tc>
@@ -8841,7 +8919,7 @@
               <w:bidi/>
             </w:pPr>
             <w:r>
-              <w:t>عرض كلمات الشكر (`/event-organizer/gratitudes`)</w:t>
+              <w:t>عرض كلمات الشكر</w:t>
             </w:r>
           </w:p>
         </w:tc>
@@ -8940,9 +9018,7 @@
             <w:r>
               <w:rPr>
                 <w:b/>
-                <w:sz w:val="34"/>
               </w:rPr>
-              <w:t>☐</w:t>
             </w:r>
           </w:p>
         </w:tc>
@@ -8958,6 +9034,7 @@
             <w:r>
               <w:rPr>
                 <w:b/>
+                <w:sz w:val="20"/>
               </w:rPr>
               <w:t>الميزة / نقطة الاختبار</w:t>
             </w:r>
@@ -8975,6 +9052,7 @@
             <w:r>
               <w:rPr>
                 <w:b/>
+                <w:sz w:val="20"/>
               </w:rPr>
               <w:t>#</w:t>
             </w:r>
@@ -9197,9 +9275,7 @@
             <w:r>
               <w:rPr>
                 <w:b/>
-                <w:sz w:val="34"/>
               </w:rPr>
-              <w:t>☐</w:t>
             </w:r>
           </w:p>
         </w:tc>
@@ -9215,6 +9291,7 @@
             <w:r>
               <w:rPr>
                 <w:b/>
+                <w:sz w:val="20"/>
               </w:rPr>
               <w:t>الميزة / نقطة الاختبار</w:t>
             </w:r>
@@ -9232,6 +9309,7 @@
             <w:r>
               <w:rPr>
                 <w:b/>
+                <w:sz w:val="20"/>
               </w:rPr>
               <w:t>#</w:t>
             </w:r>
@@ -9264,7 +9342,7 @@
               <w:bidi/>
             </w:pPr>
             <w:r>
-              <w:t>رابط «تسجيل الحضور» يظهر فقط مع `perm_scan_qr`</w:t>
+              <w:t>رابط «تسجيل الحضور» يظهر فقط عند منح الصلاحية</w:t>
             </w:r>
           </w:p>
         </w:tc>
@@ -9310,7 +9388,7 @@
               <w:bidi/>
             </w:pPr>
             <w:r>
-              <w:t>رابط «الدعوات» يظهر فقط مع `perm_send_messages`</w:t>
+              <w:t>رابط «الدعوات» يظهر فقط عند منح الصلاحية</w:t>
             </w:r>
           </w:p>
         </w:tc>
@@ -9505,9 +9583,7 @@
             <w:r>
               <w:rPr>
                 <w:b/>
-                <w:sz w:val="34"/>
               </w:rPr>
-              <w:t>☐</w:t>
             </w:r>
           </w:p>
         </w:tc>
@@ -9523,6 +9599,7 @@
             <w:r>
               <w:rPr>
                 <w:b/>
+                <w:sz w:val="20"/>
               </w:rPr>
               <w:t>الميزة / نقطة الاختبار</w:t>
             </w:r>
@@ -9540,6 +9617,7 @@
             <w:r>
               <w:rPr>
                 <w:b/>
+                <w:sz w:val="20"/>
               </w:rPr>
               <w:t>#</w:t>
             </w:r>
@@ -9572,7 +9650,7 @@
               <w:bidi/>
             </w:pPr>
             <w:r>
-              <w:t>تسجيل الدخول → التوجيه إلى `/coordinator/check-in`</w:t>
+              <w:t>تسجيل الدخول → التوجيه إلى</w:t>
             </w:r>
           </w:p>
         </w:tc>
@@ -9688,7 +9766,7 @@
         <w:pStyle w:val="Heading3"/>
       </w:pPr>
       <w:r>
-        <w:t>تسجيل الحضور (إن مُنح `perm_scan_qr`)</w:t>
+        <w:t>تسجيل الحضور</w:t>
       </w:r>
     </w:p>
     <w:tbl>
@@ -9715,9 +9793,7 @@
             <w:r>
               <w:rPr>
                 <w:b/>
-                <w:sz w:val="34"/>
               </w:rPr>
-              <w:t>☐</w:t>
             </w:r>
           </w:p>
         </w:tc>
@@ -9733,6 +9809,7 @@
             <w:r>
               <w:rPr>
                 <w:b/>
+                <w:sz w:val="20"/>
               </w:rPr>
               <w:t>الميزة / نقطة الاختبار</w:t>
             </w:r>
@@ -9750,6 +9827,7 @@
             <w:r>
               <w:rPr>
                 <w:b/>
+                <w:sz w:val="20"/>
               </w:rPr>
               <w:t>#</w:t>
             </w:r>
@@ -9782,7 +9860,7 @@
               <w:bidi/>
             </w:pPr>
             <w:r>
-              <w:t>فتح تسجيل الحضور (`/coordinator/check-in`)</w:t>
+              <w:t>فتح تسجيل الحضور</w:t>
             </w:r>
           </w:p>
         </w:tc>
@@ -9925,9 +10003,7 @@
             <w:r>
               <w:rPr>
                 <w:b/>
-                <w:sz w:val="34"/>
               </w:rPr>
-              <w:t>☐</w:t>
             </w:r>
           </w:p>
         </w:tc>
@@ -9943,6 +10019,7 @@
             <w:r>
               <w:rPr>
                 <w:b/>
+                <w:sz w:val="20"/>
               </w:rPr>
               <w:t>الميزة / نقطة الاختبار</w:t>
             </w:r>
@@ -9960,6 +10037,7 @@
             <w:r>
               <w:rPr>
                 <w:b/>
+                <w:sz w:val="20"/>
               </w:rPr>
               <w:t>#</w:t>
             </w:r>
@@ -9992,7 +10070,7 @@
               <w:bidi/>
             </w:pPr>
             <w:r>
-              <w:t>فتح صفحة الإجلاس (`/coordinator/seating`)</w:t>
+              <w:t>فتح صفحة الإجلاس</w:t>
             </w:r>
           </w:p>
         </w:tc>
@@ -10317,9 +10395,7 @@
             <w:r>
               <w:rPr>
                 <w:b/>
-                <w:sz w:val="34"/>
               </w:rPr>
-              <w:t>☐</w:t>
             </w:r>
           </w:p>
         </w:tc>
@@ -10335,6 +10411,7 @@
             <w:r>
               <w:rPr>
                 <w:b/>
+                <w:sz w:val="20"/>
               </w:rPr>
               <w:t>الميزة / نقطة الاختبار</w:t>
             </w:r>
@@ -10352,6 +10429,7 @@
             <w:r>
               <w:rPr>
                 <w:b/>
+                <w:sz w:val="20"/>
               </w:rPr>
               <w:t>#</w:t>
             </w:r>
@@ -10483,9 +10561,7 @@
             <w:r>
               <w:rPr>
                 <w:b/>
-                <w:sz w:val="34"/>
               </w:rPr>
-              <w:t>☐</w:t>
             </w:r>
           </w:p>
         </w:tc>
@@ -10501,6 +10577,7 @@
             <w:r>
               <w:rPr>
                 <w:b/>
+                <w:sz w:val="20"/>
               </w:rPr>
               <w:t>الميزة / نقطة الاختبار</w:t>
             </w:r>
@@ -10518,6 +10595,7 @@
             <w:r>
               <w:rPr>
                 <w:b/>
+                <w:sz w:val="20"/>
               </w:rPr>
               <w:t>#</w:t>
             </w:r>
@@ -10550,7 +10628,7 @@
               <w:bidi/>
             </w:pPr>
             <w:r>
-              <w:t>محاولة إضافة ضيف جديد → 403 (بدون `perm_edit_guests`)</w:t>
+              <w:t>محاولة إضافة ضيف جديد → 403 (بدون الصلاحية)</w:t>
             </w:r>
           </w:p>
         </w:tc>
@@ -10596,7 +10674,7 @@
               <w:bidi/>
             </w:pPr>
             <w:r>
-              <w:t>محاولة إرسال دعوة → 403 (بدون `perm_send_messages`)</w:t>
+              <w:t>محاولة إرسال دعوة → 403 (بدون الصلاحية)</w:t>
             </w:r>
           </w:p>
         </w:tc>
@@ -10838,9 +10916,7 @@
             <w:r>
               <w:rPr>
                 <w:b/>
-                <w:sz w:val="34"/>
               </w:rPr>
-              <w:t>☐</w:t>
             </w:r>
           </w:p>
         </w:tc>
@@ -10856,6 +10932,7 @@
             <w:r>
               <w:rPr>
                 <w:b/>
+                <w:sz w:val="20"/>
               </w:rPr>
               <w:t>الميزة / نقطة الاختبار</w:t>
             </w:r>
@@ -10873,6 +10950,7 @@
             <w:r>
               <w:rPr>
                 <w:b/>
+                <w:sz w:val="20"/>
               </w:rPr>
               <w:t>#</w:t>
             </w:r>
@@ -10905,7 +10983,7 @@
               <w:bidi/>
             </w:pPr>
             <w:r>
-              <w:t>تسجيل الدخول → التوجيه إلى `/entry-manager/check-in`</w:t>
+              <w:t>تسجيل الدخول → التوجيه إلى</w:t>
             </w:r>
           </w:p>
         </w:tc>
@@ -11048,9 +11126,7 @@
             <w:r>
               <w:rPr>
                 <w:b/>
-                <w:sz w:val="34"/>
               </w:rPr>
-              <w:t>☐</w:t>
             </w:r>
           </w:p>
         </w:tc>
@@ -11066,6 +11142,7 @@
             <w:r>
               <w:rPr>
                 <w:b/>
+                <w:sz w:val="20"/>
               </w:rPr>
               <w:t>الميزة / نقطة الاختبار</w:t>
             </w:r>
@@ -11083,6 +11160,7 @@
             <w:r>
               <w:rPr>
                 <w:b/>
+                <w:sz w:val="20"/>
               </w:rPr>
               <w:t>#</w:t>
             </w:r>
@@ -11115,7 +11193,7 @@
               <w:bidi/>
             </w:pPr>
             <w:r>
-              <w:t>فتح صفحة تسجيل الدخول (`/entry-manager/check-in`)</w:t>
+              <w:t>فتح صفحة تسجيل الدخول</w:t>
             </w:r>
           </w:p>
         </w:tc>
@@ -11396,9 +11474,7 @@
             <w:r>
               <w:rPr>
                 <w:b/>
-                <w:sz w:val="34"/>
               </w:rPr>
-              <w:t>☐</w:t>
             </w:r>
           </w:p>
         </w:tc>
@@ -11414,6 +11490,7 @@
             <w:r>
               <w:rPr>
                 <w:b/>
+                <w:sz w:val="20"/>
               </w:rPr>
               <w:t>الميزة / نقطة الاختبار</w:t>
             </w:r>
@@ -11431,6 +11508,7 @@
             <w:r>
               <w:rPr>
                 <w:b/>
+                <w:sz w:val="20"/>
               </w:rPr>
               <w:t>#</w:t>
             </w:r>
@@ -11562,9 +11640,7 @@
             <w:r>
               <w:rPr>
                 <w:b/>
-                <w:sz w:val="34"/>
               </w:rPr>
-              <w:t>☐</w:t>
             </w:r>
           </w:p>
         </w:tc>
@@ -11580,6 +11656,7 @@
             <w:r>
               <w:rPr>
                 <w:b/>
+                <w:sz w:val="20"/>
               </w:rPr>
               <w:t>الميزة / نقطة الاختبار</w:t>
             </w:r>
@@ -11597,6 +11674,7 @@
             <w:r>
               <w:rPr>
                 <w:b/>
+                <w:sz w:val="20"/>
               </w:rPr>
               <w:t>#</w:t>
             </w:r>
@@ -11629,7 +11707,7 @@
               <w:bidi/>
             </w:pPr>
             <w:r>
-              <w:t>محاولة فتح `/coordinator/seating` → مرفوض أو غير متاح</w:t>
+              <w:t>محاولة فتح → مرفوض أو غير متاح</w:t>
             </w:r>
           </w:p>
         </w:tc>
@@ -11934,7 +12012,7 @@
         <w:pStyle w:val="Heading3"/>
       </w:pPr>
       <w:r>
-        <w:t>رابط الدعوة `/i/{token}`</w:t>
+        <w:t>رابط الدعوة</w:t>
       </w:r>
     </w:p>
     <w:tbl>
@@ -11961,9 +12039,7 @@
             <w:r>
               <w:rPr>
                 <w:b/>
-                <w:sz w:val="34"/>
               </w:rPr>
-              <w:t>☐</w:t>
             </w:r>
           </w:p>
         </w:tc>
@@ -11979,6 +12055,7 @@
             <w:r>
               <w:rPr>
                 <w:b/>
+                <w:sz w:val="20"/>
               </w:rPr>
               <w:t>الميزة / نقطة الاختبار</w:t>
             </w:r>
@@ -11996,6 +12073,7 @@
             <w:r>
               <w:rPr>
                 <w:b/>
+                <w:sz w:val="20"/>
               </w:rPr>
               <w:t>#</w:t>
             </w:r>
@@ -12353,9 +12431,7 @@
             <w:r>
               <w:rPr>
                 <w:b/>
-                <w:sz w:val="34"/>
               </w:rPr>
-              <w:t>☐</w:t>
             </w:r>
           </w:p>
         </w:tc>
@@ -12371,6 +12447,7 @@
             <w:r>
               <w:rPr>
                 <w:b/>
+                <w:sz w:val="20"/>
               </w:rPr>
               <w:t>الميزة / نقطة الاختبار</w:t>
             </w:r>
@@ -12388,6 +12465,7 @@
             <w:r>
               <w:rPr>
                 <w:b/>
+                <w:sz w:val="20"/>
               </w:rPr>
               <w:t>#</w:t>
             </w:r>
@@ -12701,9 +12779,7 @@
             <w:r>
               <w:rPr>
                 <w:b/>
-                <w:sz w:val="34"/>
               </w:rPr>
-              <w:t>☐</w:t>
             </w:r>
           </w:p>
         </w:tc>
@@ -12719,6 +12795,7 @@
             <w:r>
               <w:rPr>
                 <w:b/>
+                <w:sz w:val="20"/>
               </w:rPr>
               <w:t>الميزة / نقطة الاختبار</w:t>
             </w:r>
@@ -12736,6 +12813,7 @@
             <w:r>
               <w:rPr>
                 <w:b/>
+                <w:sz w:val="20"/>
               </w:rPr>
               <w:t>#</w:t>
             </w:r>
@@ -13002,9 +13080,7 @@
             <w:r>
               <w:rPr>
                 <w:b/>
-                <w:sz w:val="34"/>
               </w:rPr>
-              <w:t>☐</w:t>
             </w:r>
           </w:p>
         </w:tc>
@@ -13020,6 +13096,7 @@
             <w:r>
               <w:rPr>
                 <w:b/>
+                <w:sz w:val="20"/>
               </w:rPr>
               <w:t>الميزة / نقطة الاختبار</w:t>
             </w:r>
@@ -13037,6 +13114,7 @@
             <w:r>
               <w:rPr>
                 <w:b/>
+                <w:sz w:val="20"/>
               </w:rPr>
               <w:t>#</w:t>
             </w:r>
@@ -13206,7 +13284,7 @@
               <w:bidi/>
             </w:pPr>
             <w:r>
-              <w:t>فتح رابط البث `/live/{token}` وتشغيل المحتوى</w:t>
+              <w:t>فتح رابط البث وتشغيل المحتوى</w:t>
             </w:r>
           </w:p>
         </w:tc>
@@ -13259,9 +13337,7 @@
             <w:r>
               <w:rPr>
                 <w:b/>
-                <w:sz w:val="34"/>
               </w:rPr>
-              <w:t>☐</w:t>
             </w:r>
           </w:p>
         </w:tc>
@@ -13277,6 +13353,7 @@
             <w:r>
               <w:rPr>
                 <w:b/>
+                <w:sz w:val="20"/>
               </w:rPr>
               <w:t>الميزة / نقطة الاختبار</w:t>
             </w:r>
@@ -13294,6 +13371,7 @@
             <w:r>
               <w:rPr>
                 <w:b/>
+                <w:sz w:val="20"/>
               </w:rPr>
               <w:t>#</w:t>
             </w:r>
@@ -13326,7 +13404,7 @@
               <w:bidi/>
             </w:pPr>
             <w:r>
-              <w:t>محاولة فتح `/login` والدخول كضيف → مرفوض</w:t>
+              <w:t>محاولة فتح والدخول كضيف → مرفوض</w:t>
             </w:r>
           </w:p>
         </w:tc>
@@ -13372,7 +13450,7 @@
               <w:bidi/>
             </w:pPr>
             <w:r>
-              <w:t>محاولة فتح `/dashboard` → إعادة توجيه لـ login</w:t>
+              <w:t>محاولة فتح → إعادة توجيه لـ login</w:t>
             </w:r>
           </w:p>
         </w:tc>
@@ -13580,6 +13658,10 @@
         <w:bidi/>
       </w:pPr>
       <w:r>
+        <w:rPr>
+          <w:b w:val="0"/>
+          <w:sz w:val="30"/>
+        </w:rPr>
         <w:t>الدور: _______________</w:t>
       </w:r>
     </w:p>
@@ -13588,6 +13670,10 @@
         <w:bidi/>
       </w:pPr>
       <w:r>
+        <w:rPr>
+          <w:b w:val="0"/>
+          <w:sz w:val="30"/>
+        </w:rPr>
         <w:t>المختبِر: _______________</w:t>
       </w:r>
     </w:p>
@@ -13596,6 +13682,10 @@
         <w:bidi/>
       </w:pPr>
       <w:r>
+        <w:rPr>
+          <w:b w:val="0"/>
+          <w:sz w:val="30"/>
+        </w:rPr>
         <w:t>التاريخ: _______________</w:t>
       </w:r>
     </w:p>
@@ -13604,6 +13694,10 @@
         <w:bidi/>
       </w:pPr>
       <w:r>
+        <w:rPr>
+          <w:b w:val="0"/>
+          <w:sz w:val="52"/>
+        </w:rPr>
         <w:t>البيئة: □ تطوير  □ إنتاج</w:t>
       </w:r>
     </w:p>
@@ -13611,12 +13705,22 @@
       <w:pPr>
         <w:bidi/>
       </w:pPr>
+      <w:r>
+        <w:rPr>
+          <w:b w:val="0"/>
+          <w:sz w:val="30"/>
+        </w:rPr>
+      </w:r>
     </w:p>
     <w:p>
       <w:pPr>
         <w:bidi/>
       </w:pPr>
       <w:r>
+        <w:rPr>
+          <w:b w:val="0"/>
+          <w:sz w:val="30"/>
+        </w:rPr>
         <w:t>عدد النقاط المنفّذة: ___ / ___</w:t>
       </w:r>
     </w:p>
@@ -13625,6 +13729,10 @@
         <w:bidi/>
       </w:pPr>
       <w:r>
+        <w:rPr>
+          <w:b w:val="0"/>
+          <w:sz w:val="30"/>
+        </w:rPr>
         <w:t>عدد النقاط الناجحة:  ___ / ___</w:t>
       </w:r>
     </w:p>
@@ -13633,6 +13741,10 @@
         <w:bidi/>
       </w:pPr>
       <w:r>
+        <w:rPr>
+          <w:b w:val="0"/>
+          <w:sz w:val="30"/>
+        </w:rPr>
         <w:t>عدد العيوب المكتشفة: ___</w:t>
       </w:r>
     </w:p>
@@ -13640,13 +13752,11 @@
       <w:pPr>
         <w:bidi/>
       </w:pPr>
-    </w:p>
-    <w:p>
-      <w:pPr>
-        <w:bidi/>
-      </w:pPr>
       <w:r>
-        <w:t>أهم 3 عيوب:</w:t>
+        <w:rPr>
+          <w:b w:val="0"/>
+          <w:sz w:val="30"/>
+        </w:rPr>
       </w:r>
     </w:p>
     <w:p>
@@ -13654,6 +13764,22 @@
         <w:bidi/>
       </w:pPr>
       <w:r>
+        <w:rPr>
+          <w:b/>
+          <w:sz w:val="30"/>
+        </w:rPr>
+        <w:t>أهم 10 عيوب:</w:t>
+      </w:r>
+    </w:p>
+    <w:p>
+      <w:pPr>
+        <w:bidi/>
+      </w:pPr>
+      <w:r>
+        <w:rPr>
+          <w:b w:val="0"/>
+          <w:sz w:val="30"/>
+        </w:rPr>
         <w:t xml:space="preserve">1. </w:t>
       </w:r>
     </w:p>
@@ -13662,6 +13788,10 @@
         <w:bidi/>
       </w:pPr>
       <w:r>
+        <w:rPr>
+          <w:b w:val="0"/>
+          <w:sz w:val="30"/>
+        </w:rPr>
         <w:t xml:space="preserve">2. </w:t>
       </w:r>
     </w:p>
@@ -13670,6 +13800,10 @@
         <w:bidi/>
       </w:pPr>
       <w:r>
+        <w:rPr>
+          <w:b w:val="0"/>
+          <w:sz w:val="30"/>
+        </w:rPr>
         <w:t xml:space="preserve">3. </w:t>
       </w:r>
     </w:p>
@@ -13677,12 +13811,106 @@
       <w:pPr>
         <w:bidi/>
       </w:pPr>
+      <w:r>
+        <w:rPr>
+          <w:b w:val="0"/>
+          <w:sz w:val="30"/>
+        </w:rPr>
+        <w:t xml:space="preserve">4. </w:t>
+      </w:r>
     </w:p>
     <w:p>
       <w:pPr>
         <w:bidi/>
       </w:pPr>
       <w:r>
+        <w:rPr>
+          <w:b w:val="0"/>
+          <w:sz w:val="30"/>
+        </w:rPr>
+        <w:t xml:space="preserve">5. </w:t>
+      </w:r>
+    </w:p>
+    <w:p>
+      <w:pPr>
+        <w:bidi/>
+      </w:pPr>
+      <w:r>
+        <w:rPr>
+          <w:b w:val="0"/>
+          <w:sz w:val="30"/>
+        </w:rPr>
+        <w:t xml:space="preserve">6. </w:t>
+      </w:r>
+    </w:p>
+    <w:p>
+      <w:pPr>
+        <w:bidi/>
+      </w:pPr>
+      <w:r>
+        <w:rPr>
+          <w:b w:val="0"/>
+          <w:sz w:val="30"/>
+        </w:rPr>
+        <w:t xml:space="preserve">7. </w:t>
+      </w:r>
+    </w:p>
+    <w:p>
+      <w:pPr>
+        <w:bidi/>
+      </w:pPr>
+      <w:r>
+        <w:rPr>
+          <w:b w:val="0"/>
+          <w:sz w:val="30"/>
+        </w:rPr>
+        <w:t xml:space="preserve">8. </w:t>
+      </w:r>
+    </w:p>
+    <w:p>
+      <w:pPr>
+        <w:bidi/>
+      </w:pPr>
+      <w:r>
+        <w:rPr>
+          <w:b w:val="0"/>
+          <w:sz w:val="30"/>
+        </w:rPr>
+        <w:t xml:space="preserve">9. </w:t>
+      </w:r>
+    </w:p>
+    <w:p>
+      <w:pPr>
+        <w:bidi/>
+      </w:pPr>
+      <w:r>
+        <w:rPr>
+          <w:b w:val="0"/>
+          <w:sz w:val="30"/>
+        </w:rPr>
+        <w:t xml:space="preserve">10. </w:t>
+      </w:r>
+    </w:p>
+    <w:p>
+      <w:pPr>
+        <w:bidi/>
+      </w:pPr>
+      <w:r>
+        <w:rPr>
+          <w:b w:val="0"/>
+          <w:sz w:val="30"/>
+        </w:rPr>
+      </w:r>
+    </w:p>
+    <w:p>
+      <w:pPr>
+        <w:bidi/>
+      </w:pPr>
+      <w:r>
+        <w:rPr>
+          <w:b w:val="0"/>
+          <w:sz w:val="52"/>
+        </w:rPr>
         <w:t>النتيجة النهائية: □ ناجح  □ ناجح بتحفظات  □ فاشل</w:t>
       </w:r>
     </w:p>
@@ -13690,13 +13918,34 @@
       <w:pPr>
         <w:bidi/>
       </w:pPr>
+      <w:r>
+        <w:rPr>
+          <w:b w:val="0"/>
+          <w:sz w:val="30"/>
+        </w:rPr>
+      </w:r>
     </w:p>
     <w:p>
       <w:pPr>
         <w:bidi/>
       </w:pPr>
       <w:r>
+        <w:rPr>
+          <w:b w:val="0"/>
+          <w:sz w:val="30"/>
+        </w:rPr>
         <w:t>ملاحظات:</w:t>
+      </w:r>
+    </w:p>
+    <w:p>
+      <w:pPr>
+        <w:bidi/>
+      </w:pPr>
+      <w:r>
+        <w:rPr>
+          <w:b w:val="0"/>
+          <w:sz w:val="30"/>
+        </w:rPr>
       </w:r>
     </w:p>
     <w:sectPr>

</xml_diff>